<commit_message>
chore(eval): re-render docx of ncctapp answering-brief on the fixed Word page lookup (fb-595.54.82)
Co-Authored-By: Claude Opus 5.5 <noreply@anthropic.com>
</commit_message>
<xml_diff>
--- a/courts/fourth-circuit/north-carolina/state/court-of-appeals/answering-brief/usage/OUTPUT-answering-brief.docx
+++ b/courts/fourth-circuit/north-carolina/state/court-of-appeals/answering-brief/usage/OUTPUT-answering-brief.docx
@@ -8133,7 +8133,7 @@
         <w:noBreakHyphen/>
       </w:r>
       <w:r>
-        <w:t xml:space="preserve">28, 35) The Board further held that, “to the extent there is a potential violation of HAVA involved in registration of voters in the past, it was remedied consistent with a separate provision of HAVA.” (R p 28) That “separate provision . . . states that a new voter registration applicant must provide an alternative form of identification before or upon voting for the first time, if the state did not have a system complying with the requirement to collect a driver’s license number or last four digits of a social security number.” (R p 27 (citing 52 U.S.C. § 21083(b)⁠(1)-⁠(3))</w:t>
+        <w:t xml:space="preserve">28, 35) The Board further held that, “to the extent there is a potential violation of HAVA involved in registration of voters in the past, it was remedied consistent with a separate provision of HAVA.” (R p 28) That “separate provision ⁠. ⁠. ⁠. states that a new voter registration applicant must provide an alternative form of identification before or upon voting for the first time, if the state did not have a system complying with the requirement to collect a driver’s license number or last four digits of a social security number.” (R p 27 (citing 52 U.S.C. § 21083(b)⁠(1)-⁠(3))</w:t>
       </w:r>
     </w:p>
     <w:p>
@@ -8227,7 +8227,7 @@
         <w:noBreakHyphen/>
       </w:r>
       <w:r>
-        <w:t xml:space="preserve">45 (citing 08 N.C. Admin. Code 17 .0109(d)))</w:t>
+        <w:t xml:space="preserve">45 (citing 08 N.C. Admin. Code 17 ⁠.0109(d)))</w:t>
       </w:r>
     </w:p>
     <w:p>
@@ -8500,7 +8500,7 @@
         <w:noBreakHyphen/>
       </w:r>
       <w:r>
-        <w:t xml:space="preserve">68 (N.C. 2025). In its second order, the Court dismissed Petitioner’s petition for a writ of prohibition, maintained its stay on the certification of the election until “any appeals . . . have been exhausted,” and ordered the Wake County Superior Court to proceed “expeditiously” on Petitioner’s three petitions for judicial review.</w:t>
+        <w:t xml:space="preserve">68 (N.C. 2025). In its second order, the Court dismissed Petitioner’s petition for a writ of prohibition, maintained its stay on the certification of the election until “any appeals ⁠. ⁠. ⁠. have been exhausted,” and ordered the Wake County Superior Court to proceed “expeditiously” on Petitioner’s three petitions for judicial review.</w:t>
       </w:r>
       <w:r>
         <w:t xml:space="preserve"> </w:t>
@@ -8834,7 +8834,7 @@
         <w:t xml:space="preserve">England</w:t>
       </w:r>
       <w:r>
-        <w:t xml:space="preserve">, 375 U.S. at 421. “When the reservation has been made . . . his right to return [to federal court] will in all events be preserved.”</w:t>
+        <w:t xml:space="preserve">, 375 U.S. at 421. “When the reservation has been made ⁠. ⁠. ⁠. his right to return [to federal court] will in all events be preserved.”</w:t>
       </w:r>
       <w:r>
         <w:t xml:space="preserve"> </w:t>
@@ -9380,7 +9380,7 @@
         <w:pStyle w:val="BodyText"/>
       </w:pPr>
       <w:r>
-        <w:t xml:space="preserve">Third, Petitioner’s protests should be denied because he failed to provide voters with adequate notice that he was challenging their votes. Here, challenged voters were mailed a postcard stating that their votes may be subject to a protest, along with a QR code that, when scanned with a smartphone, linked to a list of hundreds of protests, many of which contained thousands of names, out of alphabetical order, on hundreds of pages. This form of notice violates state law requiring persons filing protests to serve challenged voters “copies of all filings.” 08 N.C. Admin. Code 02 .0111.</w:t>
+        <w:t xml:space="preserve">Third, Petitioner’s protests should be denied because he failed to provide voters with adequate notice that he was challenging their votes. Here, challenged voters were mailed a postcard stating that their votes may be subject to a protest, along with a QR code that, when scanned with a smartphone, linked to a list of hundreds of protests, many of which contained thousands of names, out of alphabetical order, on hundreds of pages. This form of notice violates state law requiring persons filing protests to serve challenged voters “copies of all filings.” 08 N.C. Admin. Code 02 ⁠.0111.</w:t>
       </w:r>
     </w:p>
     <w:p>
@@ -10429,7 +10429,7 @@
         <w:pStyle w:val="BodyText"/>
       </w:pPr>
       <w:r>
-        <w:t xml:space="preserve">Petitioner next challenges certain votes cast by military and overseas voters who did not include a copy of a photo identification with their ballots. Long before the election, however, the Board promulgated a rule providing that these military and overseas voters were “not required to submit a photocopy of acceptable photo identification” with their absentee ballots. 08 N.C. Admin. Code 17 .0109(d). This rule was first made effective on August 23, 2019. 08 N.C. Admin. Code 17 .0109(d) (2019). During an injunction against the photo ID law, that rule expired. A substantively identical provision was then readopted as a temporary rule when the injunction was lifted and became effective on August 1, 2023, and then was made a permanent rule on April 1, 2024. Doc. Ex. I 5404;</w:t>
+        <w:t xml:space="preserve">Petitioner next challenges certain votes cast by military and overseas voters who did not include a copy of a photo identification with their ballots. Long before the election, however, the Board promulgated a rule providing that these military and overseas voters were “not required to submit a photocopy of acceptable photo identification” with their absentee ballots. 08 N.C. Admin. Code 17 ⁠.0109(d). This rule was first made effective on August 23, 2019. 08 N.C. Admin. Code 17 ⁠.0109(d) (2019). During an injunction against the photo ID law, that rule expired. A substantively identical provision was then readopted as a temporary rule when the injunction was lifted and became effective on August 1, 2023, and then was made a permanent rule on April 1, 2024. Doc. Ex. I 5404;</w:t>
       </w:r>
       <w:r>
         <w:t xml:space="preserve"> </w:t>
@@ -10445,7 +10445,7 @@
         <w:t xml:space="preserve"> </w:t>
       </w:r>
       <w:r>
-        <w:t xml:space="preserve">08 N.C. Admin. Code 17 .0109. The Rules Review Commission thus approved this rule provision three separate times, and the rule applied in five different elections before this past November’s general election.</w:t>
+        <w:t xml:space="preserve">08 N.C. Admin. Code 17 ⁠.0109. The Rules Review Commission thus approved this rule provision three separate times, and the rule applied in five different elections before this past November’s general election.</w:t>
       </w:r>
     </w:p>
     <w:p>
@@ -10861,7 +10861,7 @@
         <w:t xml:space="preserve"> </w:t>
       </w:r>
       <w:r>
-        <w:t xml:space="preserve">at 271, 607 S.E.2d at 645. Relevant statutes and the Board’s own regulations said “clearly and unambiguously” that “voters must cast ballots . . . in their precincts of residence.”</w:t>
+        <w:t xml:space="preserve">at 271, 607 S.E.2d at 645. Relevant statutes and the Board’s own regulations said “clearly and unambiguously” that “voters must cast ballots ⁠. ⁠. ⁠. in their precincts of residence.”</w:t>
       </w:r>
       <w:r>
         <w:t xml:space="preserve"> </w:t>
@@ -11169,7 +11169,7 @@
         <w:t xml:space="preserve"> </w:t>
       </w:r>
       <w:r>
-        <w:t xml:space="preserve">at 271, 607 S.E.2d at 645. Instead, it simply “remand[ed]” the “case . . . for further proceedings.”</w:t>
+        <w:t xml:space="preserve">at 271, 607 S.E.2d at 645. Instead, it simply “remand[ed]” the “case ⁠. ⁠. ⁠. for further proceedings.”</w:t>
       </w:r>
       <w:r>
         <w:t xml:space="preserve"> </w:t>
@@ -11856,7 +11856,7 @@
         <w:t xml:space="preserve">Trump</w:t>
       </w:r>
       <w:r>
-        <w:t xml:space="preserve">, 951 N.W.2d at 570. The court explained that “the proposition that laches may bar an untimely election challenge . . . appears to be recognized and applied universally.”</w:t>
+        <w:t xml:space="preserve">, 951 N.W.2d at 570. The court explained that “the proposition that laches may bar an untimely election challenge ⁠. ⁠. ⁠. appears to be recognized and applied universally.”</w:t>
       </w:r>
       <w:r>
         <w:t xml:space="preserve"> </w:t>
@@ -11982,7 +11982,7 @@
         <w:t xml:space="preserve"> </w:t>
       </w:r>
       <w:r>
-        <w:t xml:space="preserve">seeks to ensure clear and settled election rules, it does not apply to claims arising from unforeseen election-day errors or improprieties. When a party brings “claims . . . of improper electoral activity”—rather than “issues that arise in the administration of every election”—those claims do not face the</w:t>
+        <w:t xml:space="preserve">seeks to ensure clear and settled election rules, it does not apply to claims arising from unforeseen election-day errors or improprieties. When a party brings “claims ⁠. ⁠. ⁠. of improper electoral activity”—rather than “issues that arise in the administration of every election”—those claims do not face the</w:t>
       </w:r>
       <w:r>
         <w:t xml:space="preserve"> </w:t>
@@ -12617,7 +12617,7 @@
         <w:t xml:space="preserve">Morgan Stanley Cap. Grp. v. Pub. Util. Dist. No. 1</w:t>
       </w:r>
       <w:r>
-        <w:t xml:space="preserve">, 554 U.S. 527, 544 (2008) (holding that the rule that an agency decision cannot be affirmed for “justification in court different from what it provided in its opinion . . . has no application” for issues of law);</w:t>
+        <w:t xml:space="preserve">, 554 U.S. 527, 544 (2008) (holding that the rule that an agency decision cannot be affirmed for “justification in court different from what it provided in its opinion ⁠. ⁠. ⁠. has no application” for issues of law);</w:t>
       </w:r>
       <w:r>
         <w:t xml:space="preserve"> </w:t>
@@ -14081,7 +14081,7 @@
         <w:t xml:space="preserve"> </w:t>
       </w:r>
       <w:r>
-        <w:t xml:space="preserve">08 N.C. Admin. Code 02 .0111. For protests concerning “the eligibility or ineligibility of particular voters,” the forms direct persons filing protests to serve voters.</w:t>
+        <w:t xml:space="preserve">08 N.C. Admin. Code 02 ⁠.0111. For protests concerning “the eligibility or ineligibility of particular voters,” the forms direct persons filing protests to serve voters.</w:t>
       </w:r>
       <w:r>
         <w:t xml:space="preserve"> </w:t>
@@ -14137,7 +14137,7 @@
         <w:pStyle w:val="BodyText"/>
       </w:pPr>
       <w:r>
-        <w:t xml:space="preserve">Thus, Petitioner failed to serve voters with “copies” of his protests via “personal delivery, transmittal through U.S. Mail or commercial carrier service.” 08 N.C. Admin. Code 02 .0111. At best, he served voters with copies via a QR Code, in a confusing manner that failed to directly inform voters that he was actually challenging their votes. Petitioner’s protests were therefore properly rejected for failure to provide proper service.</w:t>
+        <w:t xml:space="preserve">Thus, Petitioner failed to serve voters with “copies” of his protests via “personal delivery, transmittal through U.S. Mail or commercial carrier service.” 08 N.C. Admin. Code 02 ⁠.0111. At best, he served voters with copies via a QR Code, in a confusing manner that failed to directly inform voters that he was actually challenging their votes. Petitioner’s protests were therefore properly rejected for failure to provide proper service.</w:t>
       </w:r>
     </w:p>
     <w:p>
@@ -14173,7 +14173,7 @@
         <w:pStyle w:val="BodyText"/>
       </w:pPr>
       <w:r>
-        <w:t xml:space="preserve">The Board’s duly promulgated rules, moreover, leave no doubt that Petitioner was required to notify voters in this situation, see 08 N.C. Admin. Code 02 .0111—which Petitioner expressly agreed to do. (Doc. Ex. I 8) Given this commitment, Petitioner cannot now claim he had no obligation to notify the voters he seeks to disenfranchise.</w:t>
+        <w:t xml:space="preserve">The Board’s duly promulgated rules, moreover, leave no doubt that Petitioner was required to notify voters in this situation, see 08 N.C. Admin. Code 02 ⁠.0111—which Petitioner expressly agreed to do. (Doc. Ex. I 8) Given this commitment, Petitioner cannot now claim he had no obligation to notify the voters he seeks to disenfranchise.</w:t>
       </w:r>
     </w:p>
     <w:p>
@@ -14181,7 +14181,7 @@
         <w:pStyle w:val="BodyTextNote"/>
       </w:pPr>
       <w:r>
-        <w:t xml:space="preserve">Petitioner also argues that his postcard “complied with the Board’s service demand.” Br. 62. This argument, however, cannot be squared with the text of the Board’s service rule. That rule does not require protesters to mail voters postcards stating that their votes might be affected. It rather requires service of “copies” of actual “filings” via “U.S. Mail or commercial carrier service,” so that voters know that their votes are being protested. 08 N.C. Admin. Code 02 .0111. Because Petitioner indisputably did not provide such service, the Board properly dismissed his protests.</w:t>
+        <w:t xml:space="preserve">Petitioner also argues that his postcard “complied with the Board’s service demand.” Br. 62. This argument, however, cannot be squared with the text of the Board’s service rule. That rule does not require protesters to mail voters postcards stating that their votes might be affected. It rather requires service of “copies” of actual “filings” via “U.S. Mail or commercial carrier service,” so that voters know that their votes are being protested. 08 N.C. Admin. Code 02 ⁠.0111. Because Petitioner indisputably did not provide such service, the Board properly dismissed his protests.</w:t>
       </w:r>
       <w:r>
         <w:rPr>
@@ -15314,7 +15314,7 @@
         <w:t xml:space="preserve">Maryland v. Pringle</w:t>
       </w:r>
       <w:r>
-        <w:t xml:space="preserve">, 540 U.S. 366, 371 (2003). The question is whether an objectively reasonable decisionmaker can reach a “reasonable conclusion to be drawn from the facts known . . . at the time” that a legal violation “has been or is being committed.”</w:t>
+        <w:t xml:space="preserve">, 540 U.S. 366, 371 (2003). The question is whether an objectively reasonable decisionmaker can reach a “reasonable conclusion to be drawn from the facts known ⁠. ⁠. ⁠. at the time” that a legal violation “has been or is being committed.”</w:t>
       </w:r>
       <w:r>
         <w:t xml:space="preserve"> </w:t>
@@ -16177,7 +16177,7 @@
         <w:t xml:space="preserve"> </w:t>
       </w:r>
       <w:r>
-        <w:t xml:space="preserve">One of the Board’s rules, however, has provided that “[m]ilitary and [o]verseas [v]oters” are “not required to submit a photocopy of acceptable photo identification” or an affidavit explaining their reason for not doing so. 08 N.C. Admin. Code 17 .0109(d). This rule, as shown below, accurately describes North Carolina law.</w:t>
+        <w:t xml:space="preserve">One of the Board’s rules, however, has provided that “[m]ilitary and [o]verseas [v]oters” are “not required to submit a photocopy of acceptable photo identification” or an affidavit explaining their reason for not doing so. 08 N.C. Admin. Code 17 ⁠.0109(d). This rule, as shown below, accurately describes North Carolina law.</w:t>
       </w:r>
     </w:p>
     <w:p>
@@ -17248,7 +17248,7 @@
         <w:pStyle w:val="BodyText"/>
       </w:pPr>
       <w:r>
-        <w:t xml:space="preserve">Petitioner has things backwards. This provision states that the rules in “Article 21A . . . shall not apply to or modify . . . Article [20].”</w:t>
+        <w:t xml:space="preserve">Petitioner has things backwards. This provision states that the rules in “Article 21A ⁠. ⁠. ⁠. shall not apply to or modify ⁠. ⁠. ⁠. Article [20].”</w:t>
       </w:r>
       <w:r>
         <w:t xml:space="preserve"> </w:t>
@@ -18260,7 +18260,7 @@
         <w:t xml:space="preserve"> </w:t>
       </w:r>
       <w:r>
-        <w:t xml:space="preserve">However, as a general matter, North Carolina courts should “determine the constitutionality of a statute . . . only to the extent necessary to determine that controversy.”</w:t>
+        <w:t xml:space="preserve">However, as a general matter, North Carolina courts should “determine the constitutionality of a statute ⁠. ⁠. ⁠. only to the extent necessary to determine that controversy.”</w:t>
       </w:r>
       <w:r>
         <w:t xml:space="preserve"> </w:t>
@@ -18773,7 +18773,7 @@
         <w:t xml:space="preserve">Lloyd v. Babb</w:t>
       </w:r>
       <w:r>
-        <w:t xml:space="preserve">, 296 N.C. 416, 440, 251 S.E.2d 843, 859 (1979) (emphasis removed). As a result, it is no longer clear what force the clause “[a]ny person who has resided in the State of North Carolina for one year . . . shall be entitled to vote at any election held in this State” has now. N.C. Const. art. VI, § 2(1).</w:t>
+        <w:t xml:space="preserve">, 296 N.C. 416, 440, 251 S.E.2d 843, 859 (1979) (emphasis removed). As a result, it is no longer clear what force the clause “[a]ny person who has resided in the State of North Carolina for one year ⁠. ⁠. ⁠. shall be entitled to vote at any election held in this State” has now. N.C. Const. art. VI, § 2(1).</w:t>
       </w:r>
       <w:r>
         <w:t xml:space="preserve"> </w:t>
@@ -19939,7 +19939,7 @@
         <w:pStyle w:val="BodyText"/>
       </w:pPr>
       <w:r>
-        <w:t xml:space="preserve">The Fourth Circuit “direct[ed] the district court . . . to expressly retain jurisdiction of the federal issues identified in the Board’s notice of removal should those issues remain after the resolution of the state court proceedings.” (R p 145) The district court has modified its order to do so.</w:t>
+        <w:t xml:space="preserve">The Fourth Circuit “direct[ed] the district court ⁠. ⁠. ⁠. to expressly retain jurisdiction of the federal issues identified in the Board’s notice of removal should those issues remain after the resolution of the state court proceedings.” (R p 145) The district court has modified its order to do so.</w:t>
       </w:r>
       <w:r>
         <w:t xml:space="preserve"> </w:t>
@@ -20281,7 +20281,7 @@
         <w:t xml:space="preserve"> </w:t>
       </w:r>
       <w:r>
-        <w:t xml:space="preserve">at 421 n.12 (“We are confident that state courts . . . will respect a litigant’s reservation of his federal claims for decision by the federal courts.”).</w:t>
+        <w:t xml:space="preserve">at 421 n.12 (“We are confident that state courts ⁠. ⁠. ⁠. will respect a litigant’s reservation of his federal claims for decision by the federal courts.”).</w:t>
       </w:r>
     </w:p>
     <w:p>

</xml_diff>